<commit_message>
Update project description and presentation with departments
</commit_message>
<xml_diff>
--- a/docs/NixChat-Project-Description.docx
+++ b/docs/NixChat-Project-Description.docx
@@ -1244,198 +1244,13 @@
         <w:pStyle w:val="Heading2"/>
       </w:pPr>
       <w:r>
-        <w:t xml:space="preserve">Security</w:t>
+        <w:t xml:space="preserve">Departments</w:t>
       </w:r>
     </w:p>
     <w:p>
       <w:pPr/>
       <w:r>
-        <w:t xml:space="preserve">Message contents on disk are already encrypted with AES-256-GCM; end-to-end encryption between users is the main goal of the semester.</w:t>
-      </w:r>
-    </w:p>
-    <w:p>
-      <w:pPr>
-        <w:pStyle w:val="ListParagraph"/>
-        <w:numPr>
-          <w:ilvl w:val="0"/>
-          <w:numId w:val="2"/>
-        </w:numPr>
-      </w:pPr>
-      <w:r>
-        <w:rPr>
-          <w:b/>
-        </w:rPr>
-        <w:t xml:space="preserve">Local cache.</w:t>
-      </w:r>
-      <w:r>
-        <w:t xml:space="preserve"> Each message in </w:t>
-      </w:r>
-      <w:r>
-        <w:rPr>
-          <w:rStyle w:val="CodeChar"/>
-        </w:rPr>
-        <w:t xml:space="preserve">messages-cache.tsv</w:t>
-      </w:r>
-      <w:r>
-        <w:t xml:space="preserve"> is encrypted with a random 12-byte IV and a 128-bit authentication tag. A wrong key or an edited file is detected, and the broken line is skipped instead of crashing the app.</w:t>
-      </w:r>
-    </w:p>
-    <w:p>
-      <w:pPr>
-        <w:pStyle w:val="ListParagraph"/>
-        <w:numPr>
-          <w:ilvl w:val="0"/>
-          <w:numId w:val="2"/>
-        </w:numPr>
-      </w:pPr>
-      <w:r>
-        <w:rPr>
-          <w:b/>
-        </w:rPr>
-        <w:t xml:space="preserve">Interchangeable encryption.</w:t>
-      </w:r>
-      <w:r>
-        <w:t xml:space="preserve"> The </w:t>
-      </w:r>
-      <w:r>
-        <w:rPr>
-          <w:rStyle w:val="CodeChar"/>
-        </w:rPr>
-        <w:t xml:space="preserve">Encryptor</w:t>
-      </w:r>
-      <w:r>
-        <w:t xml:space="preserve"> interface has two implementations: </w:t>
-      </w:r>
-      <w:r>
-        <w:rPr>
-          <w:rStyle w:val="CodeChar"/>
-        </w:rPr>
-        <w:t xml:space="preserve">AesGcmEncryptor</w:t>
-      </w:r>
-      <w:r>
-        <w:t xml:space="preserve"> and </w:t>
-      </w:r>
-      <w:r>
-        <w:rPr>
-          <w:rStyle w:val="CodeChar"/>
-        </w:rPr>
-        <w:t xml:space="preserve">NoOpEncryptor</w:t>
-      </w:r>
-      <w:r>
-        <w:t xml:space="preserve"> for debugging. The settings file decides which one is used.</w:t>
-      </w:r>
-    </w:p>
-    <w:p>
-      <w:pPr>
-        <w:pStyle w:val="ListParagraph"/>
-        <w:numPr>
-          <w:ilvl w:val="0"/>
-          <w:numId w:val="2"/>
-        </w:numPr>
-      </w:pPr>
-      <w:r>
-        <w:rPr>
-          <w:b/>
-        </w:rPr>
-        <w:t xml:space="preserve">End-to-end (planned).</w:t>
-      </w:r>
-      <w:r>
-        <w:t xml:space="preserve"> Clients agree on a key with X25519 and encrypt with AES-256-GCM, so the server stores and relays only ciphertext.</w:t>
-      </w:r>
-    </w:p>
-    <w:p>
-      <w:pPr>
-        <w:pStyle w:val="ListParagraph"/>
-        <w:numPr>
-          <w:ilvl w:val="0"/>
-          <w:numId w:val="2"/>
-        </w:numPr>
-      </w:pPr>
-      <w:r>
-        <w:rPr>
-          <w:b/>
-        </w:rPr>
-        <w:t xml:space="preserve">Passwords (planned).</w:t>
-      </w:r>
-      <w:r>
-        <w:t xml:space="preserve"> Hashed with BCrypt by Spring Security. This replaces the PBKDF2 code from PMC and fixes its issues: salts mixed up between users and hashes compared without a constant-time check.</w:t>
-      </w:r>
-    </w:p>
-    <w:p>
-      <w:pPr>
-        <w:pStyle w:val="ListParagraph"/>
-        <w:numPr>
-          <w:ilvl w:val="0"/>
-          <w:numId w:val="2"/>
-        </w:numPr>
-      </w:pPr>
-      <w:r>
-        <w:rPr>
-          <w:b/>
-        </w:rPr>
-        <w:t xml:space="preserve">Input limits.</w:t>
-      </w:r>
-      <w:r>
-        <w:t xml:space="preserve"> Usernames are 3–32 characters (letters, digits, </w:t>
-      </w:r>
-      <w:r>
-        <w:rPr>
-          <w:rStyle w:val="CodeChar"/>
-        </w:rPr>
-        <w:t xml:space="preserve">_</w:t>
-      </w:r>
-      <w:r>
-        <w:t xml:space="preserve">, </w:t>
-      </w:r>
-      <w:r>
-        <w:rPr>
-          <w:rStyle w:val="CodeChar"/>
-        </w:rPr>
-        <w:t xml:space="preserve">-</w:t>
-      </w:r>
-      <w:r>
-        <w:t xml:space="preserve">), messages up to 4,096 characters, files up to 50 MB; the server drops oversized messages.</w:t>
-      </w:r>
-    </w:p>
-    <w:p>
-      <w:pPr>
-        <w:pStyle w:val="Heading2"/>
-      </w:pPr>
-      <w:r>
-        <w:t xml:space="preserve">Course requirements</w:t>
-      </w:r>
-    </w:p>
-    <w:p>
-      <w:pPr/>
-      <w:r>
-        <w:t xml:space="preserve">All five steps carried over from PMC are implemented in plain Java in the </w:t>
-      </w:r>
-      <w:r>
-        <w:rPr>
-          <w:rStyle w:val="CodeChar"/>
-        </w:rPr>
-        <w:t xml:space="preserve">common</w:t>
-      </w:r>
-      <w:r>
-        <w:t xml:space="preserve"> and </w:t>
-      </w:r>
-      <w:r>
-        <w:rPr>
-          <w:rStyle w:val="CodeChar"/>
-        </w:rPr>
-        <w:t xml:space="preserve">client</w:t>
-      </w:r>
-      <w:r>
-        <w:t xml:space="preserve"> modules. File-level details are in </w:t>
-      </w:r>
-      <w:r>
-        <w:rPr>
-          <w:rStyle w:val="CodeChar"/>
-        </w:rPr>
-        <w:t xml:space="preserve">docs/REQUIREMENTS.md</w:t>
-      </w:r>
-      <w:r>
-        <w:t xml:space="preserve"> in the repository.</w:t>
+        <w:t xml:space="preserve">Like Hawk PMC, NixChat is run as a company of six departments, each with a mission and four positions. Messaging is the core product; Wallet, Music, Games and Store each add one service on top of it, and Security protects all of them.</w:t>
       </w:r>
     </w:p>
     <w:tbl>
@@ -1462,6 +1277,643 @@
           <w:p>
             <w:pPr/>
             <w:r>
+              <w:t xml:space="preserve">Department</w:t>
+            </w:r>
+          </w:p>
+        </w:tc>
+        <w:tc>
+          <w:tcPr>
+            <w:tcW w:w="3120" w:type="dxa"/>
+            <w:shd w:val="clear" w:color="auto" w:fill="F2F2F2"/>
+          </w:tcPr>
+          <w:p>
+            <w:pPr/>
+            <w:r>
+              <w:t xml:space="preserve">Mission</w:t>
+            </w:r>
+          </w:p>
+        </w:tc>
+        <w:tc>
+          <w:tcPr>
+            <w:tcW w:w="3120" w:type="dxa"/>
+            <w:shd w:val="clear" w:color="auto" w:fill="F2F2F2"/>
+          </w:tcPr>
+          <w:p>
+            <w:pPr/>
+            <w:r>
+              <w:t xml:space="preserve">Positions</w:t>
+            </w:r>
+          </w:p>
+        </w:tc>
+      </w:tr>
+      <w:tr>
+        <w:tc>
+          <w:tcPr>
+            <w:tcW w:w="3120" w:type="dxa"/>
+          </w:tcPr>
+          <w:p>
+            <w:pPr/>
+            <w:r>
+              <w:t xml:space="preserve">Messaging</w:t>
+            </w:r>
+          </w:p>
+        </w:tc>
+        <w:tc>
+          <w:tcPr>
+            <w:tcW w:w="3120" w:type="dxa"/>
+          </w:tcPr>
+          <w:p>
+            <w:pPr/>
+            <w:r>
+              <w:t xml:space="preserve">Private and group chats that deliver every message instantly</w:t>
+            </w:r>
+          </w:p>
+        </w:tc>
+        <w:tc>
+          <w:tcPr>
+            <w:tcW w:w="3120" w:type="dxa"/>
+          </w:tcPr>
+          <w:p>
+            <w:pPr/>
+            <w:r>
+              <w:t xml:space="preserve">Product Lead, Backend Developer, Client Developer, Moderator</w:t>
+            </w:r>
+          </w:p>
+        </w:tc>
+      </w:tr>
+      <w:tr>
+        <w:tc>
+          <w:tcPr>
+            <w:tcW w:w="3120" w:type="dxa"/>
+          </w:tcPr>
+          <w:p>
+            <w:pPr/>
+            <w:r>
+              <w:t xml:space="preserve">Wallet</w:t>
+            </w:r>
+          </w:p>
+        </w:tc>
+        <w:tc>
+          <w:tcPr>
+            <w:tcW w:w="3120" w:type="dxa"/>
+          </w:tcPr>
+          <w:p>
+            <w:pPr/>
+            <w:r>
+              <w:t xml:space="preserve">NixCoin, the in-app virtual currency: balances and transfers between friends</w:t>
+            </w:r>
+          </w:p>
+        </w:tc>
+        <w:tc>
+          <w:tcPr>
+            <w:tcW w:w="3120" w:type="dxa"/>
+          </w:tcPr>
+          <w:p>
+            <w:pPr/>
+            <w:r>
+              <w:t xml:space="preserve">Wallet Manager, Payments Developer, Fraud Analyst, Support Agent</w:t>
+            </w:r>
+          </w:p>
+        </w:tc>
+      </w:tr>
+      <w:tr>
+        <w:tc>
+          <w:tcPr>
+            <w:tcW w:w="3120" w:type="dxa"/>
+          </w:tcPr>
+          <w:p>
+            <w:pPr/>
+            <w:r>
+              <w:t xml:space="preserve">Music</w:t>
+            </w:r>
+          </w:p>
+        </w:tc>
+        <w:tc>
+          <w:tcPr>
+            <w:tcW w:w="3120" w:type="dxa"/>
+          </w:tcPr>
+          <w:p>
+            <w:pPr/>
+            <w:r>
+              <w:t xml:space="preserve">Sharing tracks in chats and building playlists together</w:t>
+            </w:r>
+          </w:p>
+        </w:tc>
+        <w:tc>
+          <w:tcPr>
+            <w:tcW w:w="3120" w:type="dxa"/>
+          </w:tcPr>
+          <w:p>
+            <w:pPr/>
+            <w:r>
+              <w:t xml:space="preserve">Music Curator, Audio Developer, Licensing Manager, Playlist Editor</w:t>
+            </w:r>
+          </w:p>
+        </w:tc>
+      </w:tr>
+      <w:tr>
+        <w:tc>
+          <w:tcPr>
+            <w:tcW w:w="3120" w:type="dxa"/>
+          </w:tcPr>
+          <w:p>
+            <w:pPr/>
+            <w:r>
+              <w:t xml:space="preserve">Games</w:t>
+            </w:r>
+          </w:p>
+        </w:tc>
+        <w:tc>
+          <w:tcPr>
+            <w:tcW w:w="3120" w:type="dxa"/>
+          </w:tcPr>
+          <w:p>
+            <w:pPr/>
+            <w:r>
+              <w:t xml:space="preserve">Quick games friends play right inside a chat</w:t>
+            </w:r>
+          </w:p>
+        </w:tc>
+        <w:tc>
+          <w:tcPr>
+            <w:tcW w:w="3120" w:type="dxa"/>
+          </w:tcPr>
+          <w:p>
+            <w:pPr/>
+            <w:r>
+              <w:t xml:space="preserve">Game Designer, Game Developer, QA Tester, Community Manager</w:t>
+            </w:r>
+          </w:p>
+        </w:tc>
+      </w:tr>
+      <w:tr>
+        <w:tc>
+          <w:tcPr>
+            <w:tcW w:w="3120" w:type="dxa"/>
+          </w:tcPr>
+          <w:p>
+            <w:pPr/>
+            <w:r>
+              <w:t xml:space="preserve">Store</w:t>
+            </w:r>
+          </w:p>
+        </w:tc>
+        <w:tc>
+          <w:tcPr>
+            <w:tcW w:w="3120" w:type="dxa"/>
+          </w:tcPr>
+          <w:p>
+            <w:pPr/>
+            <w:r>
+              <w:t xml:space="preserve">NixStore, a catalog of mini-apps and bots users install into NixChat</w:t>
+            </w:r>
+          </w:p>
+        </w:tc>
+        <w:tc>
+          <w:tcPr>
+            <w:tcW w:w="3120" w:type="dxa"/>
+          </w:tcPr>
+          <w:p>
+            <w:pPr/>
+            <w:r>
+              <w:t xml:space="preserve">Store Manager, App Reviewer, Platform Developer, Developer Relations</w:t>
+            </w:r>
+          </w:p>
+        </w:tc>
+      </w:tr>
+      <w:tr>
+        <w:tc>
+          <w:tcPr>
+            <w:tcW w:w="3120" w:type="dxa"/>
+          </w:tcPr>
+          <w:p>
+            <w:pPr/>
+            <w:r>
+              <w:t xml:space="preserve">Security</w:t>
+            </w:r>
+          </w:p>
+        </w:tc>
+        <w:tc>
+          <w:tcPr>
+            <w:tcW w:w="3120" w:type="dxa"/>
+          </w:tcPr>
+          <w:p>
+            <w:pPr/>
+            <w:r>
+              <w:t xml:space="preserve">Encryption, account safety and the response to incidents</w:t>
+            </w:r>
+          </w:p>
+        </w:tc>
+        <w:tc>
+          <w:tcPr>
+            <w:tcW w:w="3120" w:type="dxa"/>
+          </w:tcPr>
+          <w:p>
+            <w:pPr/>
+            <w:r>
+              <w:t xml:space="preserve">Security Lead, Crypto Engineer, Risk Analyst, Incident Responder</w:t>
+            </w:r>
+          </w:p>
+        </w:tc>
+      </w:tr>
+    </w:tbl>
+    <w:p>
+      <w:pPr/>
+      <w:r>
+        <w:t xml:space="preserve">In the code every department is a subclass of the abstract </w:t>
+      </w:r>
+      <w:r>
+        <w:rPr>
+          <w:rStyle w:val="CodeChar"/>
+        </w:rPr>
+        <w:t xml:space="preserve">Department</w:t>
+      </w:r>
+      <w:r>
+        <w:t xml:space="preserve"> class, and </w:t>
+      </w:r>
+      <w:r>
+        <w:rPr>
+          <w:rStyle w:val="CodeChar"/>
+        </w:rPr>
+        <w:t xml:space="preserve">NixChatCompany</w:t>
+      </w:r>
+      <w:r>
+        <w:t xml:space="preserve"> lists all six. Each service has its own package with a first working feature:</w:t>
+      </w:r>
+    </w:p>
+    <w:p>
+      <w:pPr>
+        <w:pStyle w:val="ListParagraph"/>
+        <w:numPr>
+          <w:ilvl w:val="0"/>
+          <w:numId w:val="2"/>
+        </w:numPr>
+      </w:pPr>
+      <w:r>
+        <w:rPr>
+          <w:b/>
+        </w:rPr>
+        <w:t xml:space="preserve">Wallet</w:t>
+      </w:r>
+      <w:r>
+        <w:t xml:space="preserve"> (</w:t>
+      </w:r>
+      <w:r>
+        <w:rPr>
+          <w:rStyle w:val="CodeChar"/>
+        </w:rPr>
+        <w:t xml:space="preserve">common.wallet</w:t>
+      </w:r>
+      <w:r>
+        <w:t xml:space="preserve">): every new wallet gets 100 NixCoin; users send coins to each other with a note. A transfer larger than the balance throws the custom checked exception </w:t>
+      </w:r>
+      <w:r>
+        <w:rPr>
+          <w:rStyle w:val="CodeChar"/>
+        </w:rPr>
+        <w:t xml:space="preserve">InsufficientFundsException</w:t>
+      </w:r>
+      <w:r>
+        <w:t xml:space="preserve">.</w:t>
+      </w:r>
+    </w:p>
+    <w:p>
+      <w:pPr>
+        <w:pStyle w:val="ListParagraph"/>
+        <w:numPr>
+          <w:ilvl w:val="0"/>
+          <w:numId w:val="2"/>
+        </w:numPr>
+      </w:pPr>
+      <w:r>
+        <w:rPr>
+          <w:b/>
+        </w:rPr>
+        <w:t xml:space="preserve">Music</w:t>
+      </w:r>
+      <w:r>
+        <w:t xml:space="preserve"> (</w:t>
+      </w:r>
+      <w:r>
+        <w:rPr>
+          <w:rStyle w:val="CodeChar"/>
+        </w:rPr>
+        <w:t xml:space="preserve">common.music</w:t>
+      </w:r>
+      <w:r>
+        <w:t xml:space="preserve">): tracks, shared playlists with invited collaborators, and </w:t>
+      </w:r>
+      <w:r>
+        <w:rPr>
+          <w:rStyle w:val="CodeChar"/>
+        </w:rPr>
+        <w:t xml:space="preserve">TrackMessage</w:t>
+      </w:r>
+      <w:r>
+        <w:t xml:space="preserve">, a new message type that also goes into the encrypted local cache.</w:t>
+      </w:r>
+    </w:p>
+    <w:p>
+      <w:pPr>
+        <w:pStyle w:val="ListParagraph"/>
+        <w:numPr>
+          <w:ilvl w:val="0"/>
+          <w:numId w:val="2"/>
+        </w:numPr>
+      </w:pPr>
+      <w:r>
+        <w:rPr>
+          <w:b/>
+        </w:rPr>
+        <w:t xml:space="preserve">Games</w:t>
+      </w:r>
+      <w:r>
+        <w:t xml:space="preserve"> (</w:t>
+      </w:r>
+      <w:r>
+        <w:rPr>
+          <w:rStyle w:val="CodeChar"/>
+        </w:rPr>
+        <w:t xml:space="preserve">common.games</w:t>
+      </w:r>
+      <w:r>
+        <w:t xml:space="preserve">): the </w:t>
+      </w:r>
+      <w:r>
+        <w:rPr>
+          <w:rStyle w:val="CodeChar"/>
+        </w:rPr>
+        <w:t xml:space="preserve">Game</w:t>
+      </w:r>
+      <w:r>
+        <w:t xml:space="preserve"> interface, the abstract </w:t>
+      </w:r>
+      <w:r>
+        <w:rPr>
+          <w:rStyle w:val="CodeChar"/>
+        </w:rPr>
+        <w:t xml:space="preserve">TurnBasedGame</w:t>
+      </w:r>
+      <w:r>
+        <w:t xml:space="preserve"> and a full tic-tac-toe with win and draw detection on a 3×3 array.</w:t>
+      </w:r>
+    </w:p>
+    <w:p>
+      <w:pPr>
+        <w:pStyle w:val="ListParagraph"/>
+        <w:numPr>
+          <w:ilvl w:val="0"/>
+          <w:numId w:val="2"/>
+        </w:numPr>
+      </w:pPr>
+      <w:r>
+        <w:rPr>
+          <w:b/>
+        </w:rPr>
+        <w:t xml:space="preserve">Store</w:t>
+      </w:r>
+      <w:r>
+        <w:t xml:space="preserve"> (</w:t>
+      </w:r>
+      <w:r>
+        <w:rPr>
+          <w:rStyle w:val="CodeChar"/>
+        </w:rPr>
+        <w:t xml:space="preserve">common.store</w:t>
+      </w:r>
+      <w:r>
+        <w:t xml:space="preserve">): publishing mini-apps, search, categories, install and uninstall, 1–5 star ratings and a top-rated list.</w:t>
+      </w:r>
+    </w:p>
+    <w:p>
+      <w:pPr/>
+      <w:r>
+        <w:t xml:space="preserve">NixCoin is a virtual currency with no real-money value, so the Wallet needs no banking license.</w:t>
+      </w:r>
+    </w:p>
+    <w:p>
+      <w:pPr>
+        <w:pStyle w:val="Heading2"/>
+      </w:pPr>
+      <w:r>
+        <w:t xml:space="preserve">Security</w:t>
+      </w:r>
+    </w:p>
+    <w:p>
+      <w:pPr/>
+      <w:r>
+        <w:t xml:space="preserve">Message contents on disk are already encrypted with AES-256-GCM; end-to-end encryption between users is the main goal of the semester.</w:t>
+      </w:r>
+    </w:p>
+    <w:p>
+      <w:pPr>
+        <w:pStyle w:val="ListParagraph"/>
+        <w:numPr>
+          <w:ilvl w:val="0"/>
+          <w:numId w:val="3"/>
+        </w:numPr>
+      </w:pPr>
+      <w:r>
+        <w:rPr>
+          <w:b/>
+        </w:rPr>
+        <w:t xml:space="preserve">Local cache.</w:t>
+      </w:r>
+      <w:r>
+        <w:t xml:space="preserve"> Each message in </w:t>
+      </w:r>
+      <w:r>
+        <w:rPr>
+          <w:rStyle w:val="CodeChar"/>
+        </w:rPr>
+        <w:t xml:space="preserve">messages-cache.tsv</w:t>
+      </w:r>
+      <w:r>
+        <w:t xml:space="preserve"> is encrypted with a random 12-byte IV and a 128-bit authentication tag. A wrong key or an edited file is detected, and the broken line is skipped instead of crashing the app.</w:t>
+      </w:r>
+    </w:p>
+    <w:p>
+      <w:pPr>
+        <w:pStyle w:val="ListParagraph"/>
+        <w:numPr>
+          <w:ilvl w:val="0"/>
+          <w:numId w:val="3"/>
+        </w:numPr>
+      </w:pPr>
+      <w:r>
+        <w:rPr>
+          <w:b/>
+        </w:rPr>
+        <w:t xml:space="preserve">Interchangeable encryption.</w:t>
+      </w:r>
+      <w:r>
+        <w:t xml:space="preserve"> The </w:t>
+      </w:r>
+      <w:r>
+        <w:rPr>
+          <w:rStyle w:val="CodeChar"/>
+        </w:rPr>
+        <w:t xml:space="preserve">Encryptor</w:t>
+      </w:r>
+      <w:r>
+        <w:t xml:space="preserve"> interface has two implementations: </w:t>
+      </w:r>
+      <w:r>
+        <w:rPr>
+          <w:rStyle w:val="CodeChar"/>
+        </w:rPr>
+        <w:t xml:space="preserve">AesGcmEncryptor</w:t>
+      </w:r>
+      <w:r>
+        <w:t xml:space="preserve"> and </w:t>
+      </w:r>
+      <w:r>
+        <w:rPr>
+          <w:rStyle w:val="CodeChar"/>
+        </w:rPr>
+        <w:t xml:space="preserve">NoOpEncryptor</w:t>
+      </w:r>
+      <w:r>
+        <w:t xml:space="preserve"> for debugging. The settings file decides which one is used.</w:t>
+      </w:r>
+    </w:p>
+    <w:p>
+      <w:pPr>
+        <w:pStyle w:val="ListParagraph"/>
+        <w:numPr>
+          <w:ilvl w:val="0"/>
+          <w:numId w:val="3"/>
+        </w:numPr>
+      </w:pPr>
+      <w:r>
+        <w:rPr>
+          <w:b/>
+        </w:rPr>
+        <w:t xml:space="preserve">End-to-end (planned).</w:t>
+      </w:r>
+      <w:r>
+        <w:t xml:space="preserve"> Clients agree on a key with X25519 and encrypt with AES-256-GCM, so the server stores and relays only ciphertext.</w:t>
+      </w:r>
+    </w:p>
+    <w:p>
+      <w:pPr>
+        <w:pStyle w:val="ListParagraph"/>
+        <w:numPr>
+          <w:ilvl w:val="0"/>
+          <w:numId w:val="3"/>
+        </w:numPr>
+      </w:pPr>
+      <w:r>
+        <w:rPr>
+          <w:b/>
+        </w:rPr>
+        <w:t xml:space="preserve">Passwords (planned).</w:t>
+      </w:r>
+      <w:r>
+        <w:t xml:space="preserve"> Hashed with BCrypt by Spring Security. This replaces the PBKDF2 code from PMC and fixes its issues: salts mixed up between users and hashes compared without a constant-time check.</w:t>
+      </w:r>
+    </w:p>
+    <w:p>
+      <w:pPr>
+        <w:pStyle w:val="ListParagraph"/>
+        <w:numPr>
+          <w:ilvl w:val="0"/>
+          <w:numId w:val="3"/>
+        </w:numPr>
+      </w:pPr>
+      <w:r>
+        <w:rPr>
+          <w:b/>
+        </w:rPr>
+        <w:t xml:space="preserve">Input limits.</w:t>
+      </w:r>
+      <w:r>
+        <w:t xml:space="preserve"> Usernames are 3–32 characters (letters, digits, </w:t>
+      </w:r>
+      <w:r>
+        <w:rPr>
+          <w:rStyle w:val="CodeChar"/>
+        </w:rPr>
+        <w:t xml:space="preserve">_</w:t>
+      </w:r>
+      <w:r>
+        <w:t xml:space="preserve">, </w:t>
+      </w:r>
+      <w:r>
+        <w:rPr>
+          <w:rStyle w:val="CodeChar"/>
+        </w:rPr>
+        <w:t xml:space="preserve">-</w:t>
+      </w:r>
+      <w:r>
+        <w:t xml:space="preserve">), messages up to 4,096 characters, files up to 50 MB; the server drops oversized messages.</w:t>
+      </w:r>
+    </w:p>
+    <w:p>
+      <w:pPr>
+        <w:pStyle w:val="Heading2"/>
+      </w:pPr>
+      <w:r>
+        <w:t xml:space="preserve">Course requirements</w:t>
+      </w:r>
+    </w:p>
+    <w:p>
+      <w:pPr/>
+      <w:r>
+        <w:t xml:space="preserve">All five steps carried over from PMC are implemented in plain Java in the </w:t>
+      </w:r>
+      <w:r>
+        <w:rPr>
+          <w:rStyle w:val="CodeChar"/>
+        </w:rPr>
+        <w:t xml:space="preserve">common</w:t>
+      </w:r>
+      <w:r>
+        <w:t xml:space="preserve"> and </w:t>
+      </w:r>
+      <w:r>
+        <w:rPr>
+          <w:rStyle w:val="CodeChar"/>
+        </w:rPr>
+        <w:t xml:space="preserve">client</w:t>
+      </w:r>
+      <w:r>
+        <w:t xml:space="preserve"> modules. File-level details are in </w:t>
+      </w:r>
+      <w:r>
+        <w:rPr>
+          <w:rStyle w:val="CodeChar"/>
+        </w:rPr>
+        <w:t xml:space="preserve">docs/REQUIREMENTS.md</w:t>
+      </w:r>
+      <w:r>
+        <w:t xml:space="preserve"> in the repository.</w:t>
+      </w:r>
+    </w:p>
+    <w:tbl>
+      <w:tblPr>
+        <w:tblStyle w:val="TableGrid"/>
+        <w:tblW w:w="0" w:type="auto"/>
+        <w:tblLayout w:type="fixed"/>
+        <w:tblLook w:val="04A0" w:firstRow="1" w:lastRow="0" w:firstColumn="0" w:lastColumn="0" w:noHBand="0" w:noVBand="1"/>
+      </w:tblPr>
+      <w:tblGrid>
+        <w:gridCol w:w="3120"/>
+        <w:gridCol w:w="3120"/>
+        <w:gridCol w:w="3120"/>
+      </w:tblGrid>
+      <w:tr>
+        <w:trPr>
+          <w:tblHeader/>
+        </w:trPr>
+        <w:tc>
+          <w:tcPr>
+            <w:tcW w:w="3120" w:type="dxa"/>
+            <w:shd w:val="clear" w:color="auto" w:fill="F2F2F2"/>
+          </w:tcPr>
+          <w:p>
+            <w:pPr/>
+            <w:r>
               <w:t xml:space="preserve">Step</w:t>
             </w:r>
           </w:p>
@@ -2506,7 +2958,7 @@
     <w:p>
       <w:pPr/>
       <w:r>
-        <w:t xml:space="preserve">The logic is covered by 21 unit tests (</w:t>
+        <w:t xml:space="preserve">The logic is covered by 32 unit tests (</w:t>
       </w:r>
       <w:r>
         <w:rPr>
@@ -2680,7 +3132,7 @@
         <w:pStyle w:val="ListParagraph"/>
         <w:numPr>
           <w:ilvl w:val="0"/>
-          <w:numId w:val="3"/>
+          <w:numId w:val="4"/>
         </w:numPr>
       </w:pPr>
       <w:r>
@@ -2698,7 +3150,7 @@
         <w:pStyle w:val="ListParagraph"/>
         <w:numPr>
           <w:ilvl w:val="0"/>
-          <w:numId w:val="3"/>
+          <w:numId w:val="4"/>
         </w:numPr>
       </w:pPr>
       <w:r>
@@ -2716,7 +3168,7 @@
         <w:pStyle w:val="ListParagraph"/>
         <w:numPr>
           <w:ilvl w:val="0"/>
-          <w:numId w:val="3"/>
+          <w:numId w:val="4"/>
         </w:numPr>
       </w:pPr>
       <w:r>
@@ -2914,6 +3366,9 @@
     <w:abstractNumId w:val="0"/>
   </w:num>
   <w:num w:numId="3">
+    <w:abstractNumId w:val="0"/>
+  </w:num>
+  <w:num w:numId="4">
     <w:abstractNumId w:val="1"/>
     <w:lvlOverride w:ilvl="0">
       <w:startOverride w:val="1"/>

</xml_diff>